<commit_message>
Embed real images in the Drive .docx documents
html-to-docx.js now embeds the actual images instead of leaving a text
reference: external S3 assets are downloaded, the local SVG/AVIF logos
are converted to PNG, and each <img>/<picture> (including linked and
inside <picture>) is inserted as a scaled ImageRun. Regenerated all 14
drive-docs/*.docx with their images embedded.

Co-Authored-By: Claude Opus 4.8 (1M context) <noreply@anthropic.com>
</commit_message>
<xml_diff>
--- a/drive-docs/adobe-partner/arquitectura-headless.docx
+++ b/drive-docs/adobe-partner/arquitectura-headless.docx
@@ -887,11 +887,44 @@
           </w:tcPr>
           <w:p>
             <w:r>
-              <w:rPr>
-                <w:i/>
-                <w:iCs/>
-              </w:rPr>
-              <w:t xml:space="preserve">[imagen: Browser frame image — http://adobe.puntos.net.s3-website-us-east-1.amazonaws.com/assets/model-3XtF6wTT.png]</w:t>
+              <w:drawing>
+                <wp:inline distT="0" distB="0" distL="0" distR="0">
+                  <wp:extent cx="4286250" cy="2428875"/>
+                  <wp:effectExtent t="0" r="0" b="0" l="0"/>
+                  <wp:docPr id="1" name="" descr="" title=""/>
+                  <wp:cNvGraphicFramePr>
+                    <a:graphicFrameLocks xmlns:a="http://schemas.openxmlformats.org/drawingml/2006/main" noChangeAspect="1"/>
+                  </wp:cNvGraphicFramePr>
+                  <a:graphic xmlns:a="http://schemas.openxmlformats.org/drawingml/2006/main">
+                    <a:graphicData uri="http://schemas.openxmlformats.org/drawingml/2006/picture">
+                      <pic:pic xmlns:pic="http://schemas.openxmlformats.org/drawingml/2006/picture">
+                        <pic:nvPicPr>
+                          <pic:cNvPr id="0" name="" descr=""/>
+                          <pic:cNvPicPr>
+                            <a:picLocks noChangeAspect="1" noChangeArrowheads="1"/>
+                          </pic:cNvPicPr>
+                        </pic:nvPicPr>
+                        <pic:blipFill>
+                          <a:blip r:embed="rId7" cstate="none"/>
+                          <a:srcRect/>
+                          <a:stretch>
+                            <a:fillRect/>
+                          </a:stretch>
+                        </pic:blipFill>
+                        <pic:spPr bwMode="auto">
+                          <a:xfrm>
+                            <a:off x="0" y="0"/>
+                            <a:ext cx="4286250" cy="2428875"/>
+                          </a:xfrm>
+                          <a:prstGeom prst="rect">
+                            <a:avLst/>
+                          </a:prstGeom>
+                        </pic:spPr>
+                      </pic:pic>
+                    </a:graphicData>
+                  </a:graphic>
+                </wp:inline>
+              </w:drawing>
             </w:r>
           </w:p>
         </w:tc>
@@ -1127,11 +1160,44 @@
           </w:tcPr>
           <w:p>
             <w:r>
-              <w:rPr>
-                <w:i/>
-                <w:iCs/>
-              </w:rPr>
-              <w:t xml:space="preserve">[imagen: Browser frame image — http://adobe.puntos.net.s3-website-us-east-1.amazonaws.com/assets/model-3XtF6wTT.png]</w:t>
+              <w:drawing>
+                <wp:inline distT="0" distB="0" distL="0" distR="0">
+                  <wp:extent cx="4286250" cy="2428875"/>
+                  <wp:effectExtent t="0" r="0" b="0" l="0"/>
+                  <wp:docPr id="1" name="" descr="" title=""/>
+                  <wp:cNvGraphicFramePr>
+                    <a:graphicFrameLocks xmlns:a="http://schemas.openxmlformats.org/drawingml/2006/main" noChangeAspect="1"/>
+                  </wp:cNvGraphicFramePr>
+                  <a:graphic xmlns:a="http://schemas.openxmlformats.org/drawingml/2006/main">
+                    <a:graphicData uri="http://schemas.openxmlformats.org/drawingml/2006/picture">
+                      <pic:pic xmlns:pic="http://schemas.openxmlformats.org/drawingml/2006/picture">
+                        <pic:nvPicPr>
+                          <pic:cNvPr id="0" name="" descr=""/>
+                          <pic:cNvPicPr>
+                            <a:picLocks noChangeAspect="1" noChangeArrowheads="1"/>
+                          </pic:cNvPicPr>
+                        </pic:nvPicPr>
+                        <pic:blipFill>
+                          <a:blip r:embed="rId7" cstate="none"/>
+                          <a:srcRect/>
+                          <a:stretch>
+                            <a:fillRect/>
+                          </a:stretch>
+                        </pic:blipFill>
+                        <pic:spPr bwMode="auto">
+                          <a:xfrm>
+                            <a:off x="0" y="0"/>
+                            <a:ext cx="4286250" cy="2428875"/>
+                          </a:xfrm>
+                          <a:prstGeom prst="rect">
+                            <a:avLst/>
+                          </a:prstGeom>
+                        </pic:spPr>
+                      </pic:pic>
+                    </a:graphicData>
+                  </a:graphic>
+                </wp:inline>
+              </w:drawing>
             </w:r>
           </w:p>
         </w:tc>

</xml_diff>

<commit_message>
Fix docx tables collapsing to vertical text (fixed column widths)
Tables had no explicit grid, so Google Docs auto-layout shrank the first
column to a single character, rendering text one letter per line. Now
each block table declares a fixed layout with an explicit column grid
(9360 dxa total split evenly by column count) and the block-name header
spans all columns. Regenerated all 14 drive-docs/*.docx.

Co-Authored-By: Claude Opus 4.8 (1M context) <noreply@anthropic.com>
</commit_message>
<xml_diff>
--- a/drive-docs/adobe-partner/arquitectura-headless.docx
+++ b/drive-docs/adobe-partner/arquitectura-headless.docx
@@ -4,7 +4,7 @@
   <w:body>
     <w:tbl>
       <w:tblPr>
-        <w:tblW w:type="pct" w:w="100%"/>
+        <w:tblW w:type="dxa" w:w="9360"/>
         <w:tblBorders>
           <w:top w:val="single" w:color="auto" w:sz="4"/>
           <w:left w:val="single" w:color="auto" w:sz="4"/>
@@ -13,14 +13,17 @@
           <w:insideH w:val="single" w:color="auto" w:sz="4"/>
           <w:insideV w:val="single" w:color="auto" w:sz="4"/>
         </w:tblBorders>
+        <w:tblLayout w:type="fixed"/>
       </w:tblPr>
       <w:tblGrid>
-        <w:gridCol w:w="100"/>
-        <w:gridCol w:w="100"/>
+        <w:gridCol w:w="4680"/>
+        <w:gridCol w:w="4680"/>
       </w:tblGrid>
       <w:tr>
         <w:tc>
           <w:tcPr>
+            <w:tcW w:type="dxa" w:w="9360"/>
+            <w:gridSpan w:val="2"/>
             <w:tcBorders>
               <w:top w:val="single" w:color="999999" w:sz="4"/>
               <w:left w:val="single" w:color="999999" w:sz="4"/>
@@ -42,6 +45,7 @@
       <w:tr>
         <w:tc>
           <w:tcPr>
+            <w:tcW w:type="dxa" w:w="4680"/>
             <w:tcBorders>
               <w:top w:val="single" w:color="999999" w:sz="4"/>
               <w:left w:val="single" w:color="999999" w:sz="4"/>
@@ -57,6 +61,7 @@
         </w:tc>
         <w:tc>
           <w:tcPr>
+            <w:tcW w:type="dxa" w:w="4680"/>
             <w:tcBorders>
               <w:top w:val="single" w:color="999999" w:sz="4"/>
               <w:left w:val="single" w:color="999999" w:sz="4"/>
@@ -79,7 +84,7 @@
     </w:p>
     <w:tbl>
       <w:tblPr>
-        <w:tblW w:type="pct" w:w="100%"/>
+        <w:tblW w:type="dxa" w:w="9360"/>
         <w:tblBorders>
           <w:top w:val="single" w:color="auto" w:sz="4"/>
           <w:left w:val="single" w:color="auto" w:sz="4"/>
@@ -88,13 +93,16 @@
           <w:insideH w:val="single" w:color="auto" w:sz="4"/>
           <w:insideV w:val="single" w:color="auto" w:sz="4"/>
         </w:tblBorders>
+        <w:tblLayout w:type="fixed"/>
       </w:tblPr>
       <w:tblGrid>
-        <w:gridCol w:w="100"/>
+        <w:gridCol w:w="9360"/>
       </w:tblGrid>
       <w:tr>
         <w:tc>
           <w:tcPr>
+            <w:tcW w:type="dxa" w:w="9360"/>
+            <w:gridSpan w:val="1"/>
             <w:tcBorders>
               <w:top w:val="single" w:color="999999" w:sz="4"/>
               <w:left w:val="single" w:color="999999" w:sz="4"/>
@@ -116,6 +124,7 @@
       <w:tr>
         <w:tc>
           <w:tcPr>
+            <w:tcW w:type="dxa" w:w="9360"/>
             <w:tcBorders>
               <w:top w:val="single" w:color="999999" w:sz="4"/>
               <w:left w:val="single" w:color="999999" w:sz="4"/>
@@ -151,7 +160,7 @@
     </w:p>
     <w:tbl>
       <w:tblPr>
-        <w:tblW w:type="pct" w:w="100%"/>
+        <w:tblW w:type="dxa" w:w="9360"/>
         <w:tblBorders>
           <w:top w:val="single" w:color="auto" w:sz="4"/>
           <w:left w:val="single" w:color="auto" w:sz="4"/>
@@ -160,14 +169,17 @@
           <w:insideH w:val="single" w:color="auto" w:sz="4"/>
           <w:insideV w:val="single" w:color="auto" w:sz="4"/>
         </w:tblBorders>
+        <w:tblLayout w:type="fixed"/>
       </w:tblPr>
       <w:tblGrid>
-        <w:gridCol w:w="100"/>
-        <w:gridCol w:w="100"/>
+        <w:gridCol w:w="4680"/>
+        <w:gridCol w:w="4680"/>
       </w:tblGrid>
       <w:tr>
         <w:tc>
           <w:tcPr>
+            <w:tcW w:type="dxa" w:w="9360"/>
+            <w:gridSpan w:val="2"/>
             <w:tcBorders>
               <w:top w:val="single" w:color="999999" w:sz="4"/>
               <w:left w:val="single" w:color="999999" w:sz="4"/>
@@ -189,6 +201,7 @@
       <w:tr>
         <w:tc>
           <w:tcPr>
+            <w:tcW w:type="dxa" w:w="4680"/>
             <w:tcBorders>
               <w:top w:val="single" w:color="999999" w:sz="4"/>
               <w:left w:val="single" w:color="999999" w:sz="4"/>
@@ -204,6 +217,7 @@
         </w:tc>
         <w:tc>
           <w:tcPr>
+            <w:tcW w:type="dxa" w:w="4680"/>
             <w:tcBorders>
               <w:top w:val="single" w:color="999999" w:sz="4"/>
               <w:left w:val="single" w:color="999999" w:sz="4"/>
@@ -226,7 +240,7 @@
     </w:p>
     <w:tbl>
       <w:tblPr>
-        <w:tblW w:type="pct" w:w="100%"/>
+        <w:tblW w:type="dxa" w:w="9360"/>
         <w:tblBorders>
           <w:top w:val="single" w:color="auto" w:sz="4"/>
           <w:left w:val="single" w:color="auto" w:sz="4"/>
@@ -235,13 +249,16 @@
           <w:insideH w:val="single" w:color="auto" w:sz="4"/>
           <w:insideV w:val="single" w:color="auto" w:sz="4"/>
         </w:tblBorders>
+        <w:tblLayout w:type="fixed"/>
       </w:tblPr>
       <w:tblGrid>
-        <w:gridCol w:w="100"/>
+        <w:gridCol w:w="9360"/>
       </w:tblGrid>
       <w:tr>
         <w:tc>
           <w:tcPr>
+            <w:tcW w:type="dxa" w:w="9360"/>
+            <w:gridSpan w:val="1"/>
             <w:tcBorders>
               <w:top w:val="single" w:color="999999" w:sz="4"/>
               <w:left w:val="single" w:color="999999" w:sz="4"/>
@@ -263,6 +280,7 @@
       <w:tr>
         <w:tc>
           <w:tcPr>
+            <w:tcW w:type="dxa" w:w="9360"/>
             <w:tcBorders>
               <w:top w:val="single" w:color="999999" w:sz="4"/>
               <w:left w:val="single" w:color="999999" w:sz="4"/>
@@ -290,7 +308,7 @@
     </w:p>
     <w:tbl>
       <w:tblPr>
-        <w:tblW w:type="pct" w:w="100%"/>
+        <w:tblW w:type="dxa" w:w="9360"/>
         <w:tblBorders>
           <w:top w:val="single" w:color="auto" w:sz="4"/>
           <w:left w:val="single" w:color="auto" w:sz="4"/>
@@ -299,14 +317,17 @@
           <w:insideH w:val="single" w:color="auto" w:sz="4"/>
           <w:insideV w:val="single" w:color="auto" w:sz="4"/>
         </w:tblBorders>
+        <w:tblLayout w:type="fixed"/>
       </w:tblPr>
       <w:tblGrid>
-        <w:gridCol w:w="100"/>
-        <w:gridCol w:w="100"/>
+        <w:gridCol w:w="4680"/>
+        <w:gridCol w:w="4680"/>
       </w:tblGrid>
       <w:tr>
         <w:tc>
           <w:tcPr>
+            <w:tcW w:type="dxa" w:w="9360"/>
+            <w:gridSpan w:val="2"/>
             <w:tcBorders>
               <w:top w:val="single" w:color="999999" w:sz="4"/>
               <w:left w:val="single" w:color="999999" w:sz="4"/>
@@ -328,6 +349,7 @@
       <w:tr>
         <w:tc>
           <w:tcPr>
+            <w:tcW w:type="dxa" w:w="4680"/>
             <w:tcBorders>
               <w:top w:val="single" w:color="999999" w:sz="4"/>
               <w:left w:val="single" w:color="999999" w:sz="4"/>
@@ -343,6 +365,7 @@
         </w:tc>
         <w:tc>
           <w:tcPr>
+            <w:tcW w:type="dxa" w:w="4680"/>
             <w:tcBorders>
               <w:top w:val="single" w:color="999999" w:sz="4"/>
               <w:left w:val="single" w:color="999999" w:sz="4"/>
@@ -360,6 +383,7 @@
       <w:tr>
         <w:tc>
           <w:tcPr>
+            <w:tcW w:type="dxa" w:w="4680"/>
             <w:tcBorders>
               <w:top w:val="single" w:color="999999" w:sz="4"/>
               <w:left w:val="single" w:color="999999" w:sz="4"/>
@@ -375,6 +399,7 @@
         </w:tc>
         <w:tc>
           <w:tcPr>
+            <w:tcW w:type="dxa" w:w="4680"/>
             <w:tcBorders>
               <w:top w:val="single" w:color="999999" w:sz="4"/>
               <w:left w:val="single" w:color="999999" w:sz="4"/>
@@ -392,6 +417,7 @@
       <w:tr>
         <w:tc>
           <w:tcPr>
+            <w:tcW w:type="dxa" w:w="4680"/>
             <w:tcBorders>
               <w:top w:val="single" w:color="999999" w:sz="4"/>
               <w:left w:val="single" w:color="999999" w:sz="4"/>
@@ -407,6 +433,7 @@
         </w:tc>
         <w:tc>
           <w:tcPr>
+            <w:tcW w:type="dxa" w:w="4680"/>
             <w:tcBorders>
               <w:top w:val="single" w:color="999999" w:sz="4"/>
               <w:left w:val="single" w:color="999999" w:sz="4"/>
@@ -424,6 +451,7 @@
       <w:tr>
         <w:tc>
           <w:tcPr>
+            <w:tcW w:type="dxa" w:w="4680"/>
             <w:tcBorders>
               <w:top w:val="single" w:color="999999" w:sz="4"/>
               <w:left w:val="single" w:color="999999" w:sz="4"/>
@@ -439,6 +467,7 @@
         </w:tc>
         <w:tc>
           <w:tcPr>
+            <w:tcW w:type="dxa" w:w="4680"/>
             <w:tcBorders>
               <w:top w:val="single" w:color="999999" w:sz="4"/>
               <w:left w:val="single" w:color="999999" w:sz="4"/>
@@ -466,7 +495,7 @@
     </w:p>
     <w:tbl>
       <w:tblPr>
-        <w:tblW w:type="pct" w:w="100%"/>
+        <w:tblW w:type="dxa" w:w="9360"/>
         <w:tblBorders>
           <w:top w:val="single" w:color="auto" w:sz="4"/>
           <w:left w:val="single" w:color="auto" w:sz="4"/>
@@ -475,14 +504,17 @@
           <w:insideH w:val="single" w:color="auto" w:sz="4"/>
           <w:insideV w:val="single" w:color="auto" w:sz="4"/>
         </w:tblBorders>
+        <w:tblLayout w:type="fixed"/>
       </w:tblPr>
       <w:tblGrid>
-        <w:gridCol w:w="100"/>
-        <w:gridCol w:w="100"/>
+        <w:gridCol w:w="4680"/>
+        <w:gridCol w:w="4680"/>
       </w:tblGrid>
       <w:tr>
         <w:tc>
           <w:tcPr>
+            <w:tcW w:type="dxa" w:w="9360"/>
+            <w:gridSpan w:val="2"/>
             <w:tcBorders>
               <w:top w:val="single" w:color="999999" w:sz="4"/>
               <w:left w:val="single" w:color="999999" w:sz="4"/>
@@ -504,6 +536,7 @@
       <w:tr>
         <w:tc>
           <w:tcPr>
+            <w:tcW w:type="dxa" w:w="4680"/>
             <w:tcBorders>
               <w:top w:val="single" w:color="999999" w:sz="4"/>
               <w:left w:val="single" w:color="999999" w:sz="4"/>
@@ -519,6 +552,7 @@
         </w:tc>
         <w:tc>
           <w:tcPr>
+            <w:tcW w:type="dxa" w:w="4680"/>
             <w:tcBorders>
               <w:top w:val="single" w:color="999999" w:sz="4"/>
               <w:left w:val="single" w:color="999999" w:sz="4"/>
@@ -541,7 +575,7 @@
     </w:p>
     <w:tbl>
       <w:tblPr>
-        <w:tblW w:type="pct" w:w="100%"/>
+        <w:tblW w:type="dxa" w:w="9360"/>
         <w:tblBorders>
           <w:top w:val="single" w:color="auto" w:sz="4"/>
           <w:left w:val="single" w:color="auto" w:sz="4"/>
@@ -550,13 +584,16 @@
           <w:insideH w:val="single" w:color="auto" w:sz="4"/>
           <w:insideV w:val="single" w:color="auto" w:sz="4"/>
         </w:tblBorders>
+        <w:tblLayout w:type="fixed"/>
       </w:tblPr>
       <w:tblGrid>
-        <w:gridCol w:w="100"/>
+        <w:gridCol w:w="9360"/>
       </w:tblGrid>
       <w:tr>
         <w:tc>
           <w:tcPr>
+            <w:tcW w:type="dxa" w:w="9360"/>
+            <w:gridSpan w:val="1"/>
             <w:tcBorders>
               <w:top w:val="single" w:color="999999" w:sz="4"/>
               <w:left w:val="single" w:color="999999" w:sz="4"/>
@@ -578,6 +615,7 @@
       <w:tr>
         <w:tc>
           <w:tcPr>
+            <w:tcW w:type="dxa" w:w="9360"/>
             <w:tcBorders>
               <w:top w:val="single" w:color="999999" w:sz="4"/>
               <w:left w:val="single" w:color="999999" w:sz="4"/>
@@ -605,7 +643,7 @@
     </w:p>
     <w:tbl>
       <w:tblPr>
-        <w:tblW w:type="pct" w:w="100%"/>
+        <w:tblW w:type="dxa" w:w="9360"/>
         <w:tblBorders>
           <w:top w:val="single" w:color="auto" w:sz="4"/>
           <w:left w:val="single" w:color="auto" w:sz="4"/>
@@ -614,14 +652,17 @@
           <w:insideH w:val="single" w:color="auto" w:sz="4"/>
           <w:insideV w:val="single" w:color="auto" w:sz="4"/>
         </w:tblBorders>
+        <w:tblLayout w:type="fixed"/>
       </w:tblPr>
       <w:tblGrid>
-        <w:gridCol w:w="100"/>
-        <w:gridCol w:w="100"/>
+        <w:gridCol w:w="4680"/>
+        <w:gridCol w:w="4680"/>
       </w:tblGrid>
       <w:tr>
         <w:tc>
           <w:tcPr>
+            <w:tcW w:type="dxa" w:w="9360"/>
+            <w:gridSpan w:val="2"/>
             <w:tcBorders>
               <w:top w:val="single" w:color="999999" w:sz="4"/>
               <w:left w:val="single" w:color="999999" w:sz="4"/>
@@ -643,6 +684,7 @@
       <w:tr>
         <w:tc>
           <w:tcPr>
+            <w:tcW w:type="dxa" w:w="4680"/>
             <w:tcBorders>
               <w:top w:val="single" w:color="999999" w:sz="4"/>
               <w:left w:val="single" w:color="999999" w:sz="4"/>
@@ -658,6 +700,7 @@
         </w:tc>
         <w:tc>
           <w:tcPr>
+            <w:tcW w:type="dxa" w:w="4680"/>
             <w:tcBorders>
               <w:top w:val="single" w:color="999999" w:sz="4"/>
               <w:left w:val="single" w:color="999999" w:sz="4"/>
@@ -675,6 +718,7 @@
       <w:tr>
         <w:tc>
           <w:tcPr>
+            <w:tcW w:type="dxa" w:w="4680"/>
             <w:tcBorders>
               <w:top w:val="single" w:color="999999" w:sz="4"/>
               <w:left w:val="single" w:color="999999" w:sz="4"/>
@@ -690,6 +734,7 @@
         </w:tc>
         <w:tc>
           <w:tcPr>
+            <w:tcW w:type="dxa" w:w="4680"/>
             <w:tcBorders>
               <w:top w:val="single" w:color="999999" w:sz="4"/>
               <w:left w:val="single" w:color="999999" w:sz="4"/>
@@ -707,6 +752,7 @@
       <w:tr>
         <w:tc>
           <w:tcPr>
+            <w:tcW w:type="dxa" w:w="4680"/>
             <w:tcBorders>
               <w:top w:val="single" w:color="999999" w:sz="4"/>
               <w:left w:val="single" w:color="999999" w:sz="4"/>
@@ -722,6 +768,7 @@
         </w:tc>
         <w:tc>
           <w:tcPr>
+            <w:tcW w:type="dxa" w:w="4680"/>
             <w:tcBorders>
               <w:top w:val="single" w:color="999999" w:sz="4"/>
               <w:left w:val="single" w:color="999999" w:sz="4"/>
@@ -739,6 +786,7 @@
       <w:tr>
         <w:tc>
           <w:tcPr>
+            <w:tcW w:type="dxa" w:w="4680"/>
             <w:tcBorders>
               <w:top w:val="single" w:color="999999" w:sz="4"/>
               <w:left w:val="single" w:color="999999" w:sz="4"/>
@@ -754,6 +802,7 @@
         </w:tc>
         <w:tc>
           <w:tcPr>
+            <w:tcW w:type="dxa" w:w="4680"/>
             <w:tcBorders>
               <w:top w:val="single" w:color="999999" w:sz="4"/>
               <w:left w:val="single" w:color="999999" w:sz="4"/>
@@ -771,6 +820,7 @@
       <w:tr>
         <w:tc>
           <w:tcPr>
+            <w:tcW w:type="dxa" w:w="4680"/>
             <w:tcBorders>
               <w:top w:val="single" w:color="999999" w:sz="4"/>
               <w:left w:val="single" w:color="999999" w:sz="4"/>
@@ -786,6 +836,7 @@
         </w:tc>
         <w:tc>
           <w:tcPr>
+            <w:tcW w:type="dxa" w:w="4680"/>
             <w:tcBorders>
               <w:top w:val="single" w:color="999999" w:sz="4"/>
               <w:left w:val="single" w:color="999999" w:sz="4"/>
@@ -808,7 +859,7 @@
     </w:p>
     <w:tbl>
       <w:tblPr>
-        <w:tblW w:type="pct" w:w="100%"/>
+        <w:tblW w:type="dxa" w:w="9360"/>
         <w:tblBorders>
           <w:top w:val="single" w:color="auto" w:sz="4"/>
           <w:left w:val="single" w:color="auto" w:sz="4"/>
@@ -817,14 +868,17 @@
           <w:insideH w:val="single" w:color="auto" w:sz="4"/>
           <w:insideV w:val="single" w:color="auto" w:sz="4"/>
         </w:tblBorders>
+        <w:tblLayout w:type="fixed"/>
       </w:tblPr>
       <w:tblGrid>
-        <w:gridCol w:w="100"/>
-        <w:gridCol w:w="100"/>
+        <w:gridCol w:w="4680"/>
+        <w:gridCol w:w="4680"/>
       </w:tblGrid>
       <w:tr>
         <w:tc>
           <w:tcPr>
+            <w:tcW w:type="dxa" w:w="9360"/>
+            <w:gridSpan w:val="2"/>
             <w:tcBorders>
               <w:top w:val="single" w:color="999999" w:sz="4"/>
               <w:left w:val="single" w:color="999999" w:sz="4"/>
@@ -846,6 +900,7 @@
       <w:tr>
         <w:tc>
           <w:tcPr>
+            <w:tcW w:type="dxa" w:w="4680"/>
             <w:tcBorders>
               <w:top w:val="single" w:color="999999" w:sz="4"/>
               <w:left w:val="single" w:color="999999" w:sz="4"/>
@@ -861,6 +916,7 @@
         </w:tc>
         <w:tc>
           <w:tcPr>
+            <w:tcW w:type="dxa" w:w="4680"/>
             <w:tcBorders>
               <w:top w:val="single" w:color="999999" w:sz="4"/>
               <w:left w:val="single" w:color="999999" w:sz="4"/>
@@ -878,6 +934,7 @@
       <w:tr>
         <w:tc>
           <w:tcPr>
+            <w:tcW w:type="dxa" w:w="4680"/>
             <w:tcBorders>
               <w:top w:val="single" w:color="999999" w:sz="4"/>
               <w:left w:val="single" w:color="999999" w:sz="4"/>
@@ -942,7 +999,7 @@
     </w:p>
     <w:tbl>
       <w:tblPr>
-        <w:tblW w:type="pct" w:w="100%"/>
+        <w:tblW w:type="dxa" w:w="9360"/>
         <w:tblBorders>
           <w:top w:val="single" w:color="auto" w:sz="4"/>
           <w:left w:val="single" w:color="auto" w:sz="4"/>
@@ -951,14 +1008,17 @@
           <w:insideH w:val="single" w:color="auto" w:sz="4"/>
           <w:insideV w:val="single" w:color="auto" w:sz="4"/>
         </w:tblBorders>
+        <w:tblLayout w:type="fixed"/>
       </w:tblPr>
       <w:tblGrid>
-        <w:gridCol w:w="100"/>
-        <w:gridCol w:w="100"/>
+        <w:gridCol w:w="4680"/>
+        <w:gridCol w:w="4680"/>
       </w:tblGrid>
       <w:tr>
         <w:tc>
           <w:tcPr>
+            <w:tcW w:type="dxa" w:w="9360"/>
+            <w:gridSpan w:val="2"/>
             <w:tcBorders>
               <w:top w:val="single" w:color="999999" w:sz="4"/>
               <w:left w:val="single" w:color="999999" w:sz="4"/>
@@ -980,6 +1040,7 @@
       <w:tr>
         <w:tc>
           <w:tcPr>
+            <w:tcW w:type="dxa" w:w="4680"/>
             <w:tcBorders>
               <w:top w:val="single" w:color="999999" w:sz="4"/>
               <w:left w:val="single" w:color="999999" w:sz="4"/>
@@ -995,6 +1056,7 @@
         </w:tc>
         <w:tc>
           <w:tcPr>
+            <w:tcW w:type="dxa" w:w="4680"/>
             <w:tcBorders>
               <w:top w:val="single" w:color="999999" w:sz="4"/>
               <w:left w:val="single" w:color="999999" w:sz="4"/>
@@ -1017,7 +1079,7 @@
     </w:p>
     <w:tbl>
       <w:tblPr>
-        <w:tblW w:type="pct" w:w="100%"/>
+        <w:tblW w:type="dxa" w:w="9360"/>
         <w:tblBorders>
           <w:top w:val="single" w:color="auto" w:sz="4"/>
           <w:left w:val="single" w:color="auto" w:sz="4"/>
@@ -1026,13 +1088,16 @@
           <w:insideH w:val="single" w:color="auto" w:sz="4"/>
           <w:insideV w:val="single" w:color="auto" w:sz="4"/>
         </w:tblBorders>
+        <w:tblLayout w:type="fixed"/>
       </w:tblPr>
       <w:tblGrid>
-        <w:gridCol w:w="100"/>
+        <w:gridCol w:w="9360"/>
       </w:tblGrid>
       <w:tr>
         <w:tc>
           <w:tcPr>
+            <w:tcW w:type="dxa" w:w="9360"/>
+            <w:gridSpan w:val="1"/>
             <w:tcBorders>
               <w:top w:val="single" w:color="999999" w:sz="4"/>
               <w:left w:val="single" w:color="999999" w:sz="4"/>
@@ -1054,6 +1119,7 @@
       <w:tr>
         <w:tc>
           <w:tcPr>
+            <w:tcW w:type="dxa" w:w="9360"/>
             <w:tcBorders>
               <w:top w:val="single" w:color="999999" w:sz="4"/>
               <w:left w:val="single" w:color="999999" w:sz="4"/>
@@ -1081,7 +1147,7 @@
     </w:p>
     <w:tbl>
       <w:tblPr>
-        <w:tblW w:type="pct" w:w="100%"/>
+        <w:tblW w:type="dxa" w:w="9360"/>
         <w:tblBorders>
           <w:top w:val="single" w:color="auto" w:sz="4"/>
           <w:left w:val="single" w:color="auto" w:sz="4"/>
@@ -1090,14 +1156,17 @@
           <w:insideH w:val="single" w:color="auto" w:sz="4"/>
           <w:insideV w:val="single" w:color="auto" w:sz="4"/>
         </w:tblBorders>
+        <w:tblLayout w:type="fixed"/>
       </w:tblPr>
       <w:tblGrid>
-        <w:gridCol w:w="100"/>
-        <w:gridCol w:w="100"/>
+        <w:gridCol w:w="4680"/>
+        <w:gridCol w:w="4680"/>
       </w:tblGrid>
       <w:tr>
         <w:tc>
           <w:tcPr>
+            <w:tcW w:type="dxa" w:w="9360"/>
+            <w:gridSpan w:val="2"/>
             <w:tcBorders>
               <w:top w:val="single" w:color="999999" w:sz="4"/>
               <w:left w:val="single" w:color="999999" w:sz="4"/>
@@ -1119,6 +1188,7 @@
       <w:tr>
         <w:tc>
           <w:tcPr>
+            <w:tcW w:type="dxa" w:w="4680"/>
             <w:tcBorders>
               <w:top w:val="single" w:color="999999" w:sz="4"/>
               <w:left w:val="single" w:color="999999" w:sz="4"/>
@@ -1134,6 +1204,7 @@
         </w:tc>
         <w:tc>
           <w:tcPr>
+            <w:tcW w:type="dxa" w:w="4680"/>
             <w:tcBorders>
               <w:top w:val="single" w:color="999999" w:sz="4"/>
               <w:left w:val="single" w:color="999999" w:sz="4"/>
@@ -1151,6 +1222,7 @@
       <w:tr>
         <w:tc>
           <w:tcPr>
+            <w:tcW w:type="dxa" w:w="4680"/>
             <w:tcBorders>
               <w:top w:val="single" w:color="999999" w:sz="4"/>
               <w:left w:val="single" w:color="999999" w:sz="4"/>
@@ -1210,7 +1282,7 @@
     </w:p>
     <w:tbl>
       <w:tblPr>
-        <w:tblW w:type="pct" w:w="100%"/>
+        <w:tblW w:type="dxa" w:w="9360"/>
         <w:tblBorders>
           <w:top w:val="single" w:color="auto" w:sz="4"/>
           <w:left w:val="single" w:color="auto" w:sz="4"/>
@@ -1219,14 +1291,17 @@
           <w:insideH w:val="single" w:color="auto" w:sz="4"/>
           <w:insideV w:val="single" w:color="auto" w:sz="4"/>
         </w:tblBorders>
+        <w:tblLayout w:type="fixed"/>
       </w:tblPr>
       <w:tblGrid>
-        <w:gridCol w:w="100"/>
-        <w:gridCol w:w="100"/>
+        <w:gridCol w:w="4680"/>
+        <w:gridCol w:w="4680"/>
       </w:tblGrid>
       <w:tr>
         <w:tc>
           <w:tcPr>
+            <w:tcW w:type="dxa" w:w="9360"/>
+            <w:gridSpan w:val="2"/>
             <w:tcBorders>
               <w:top w:val="single" w:color="999999" w:sz="4"/>
               <w:left w:val="single" w:color="999999" w:sz="4"/>
@@ -1248,6 +1323,7 @@
       <w:tr>
         <w:tc>
           <w:tcPr>
+            <w:tcW w:type="dxa" w:w="4680"/>
             <w:tcBorders>
               <w:top w:val="single" w:color="999999" w:sz="4"/>
               <w:left w:val="single" w:color="999999" w:sz="4"/>
@@ -1263,6 +1339,7 @@
         </w:tc>
         <w:tc>
           <w:tcPr>
+            <w:tcW w:type="dxa" w:w="4680"/>
             <w:tcBorders>
               <w:top w:val="single" w:color="999999" w:sz="4"/>
               <w:left w:val="single" w:color="999999" w:sz="4"/>
@@ -1280,6 +1357,7 @@
       <w:tr>
         <w:tc>
           <w:tcPr>
+            <w:tcW w:type="dxa" w:w="4680"/>
             <w:tcBorders>
               <w:top w:val="single" w:color="999999" w:sz="4"/>
               <w:left w:val="single" w:color="999999" w:sz="4"/>
@@ -1295,6 +1373,7 @@
         </w:tc>
         <w:tc>
           <w:tcPr>
+            <w:tcW w:type="dxa" w:w="4680"/>
             <w:tcBorders>
               <w:top w:val="single" w:color="999999" w:sz="4"/>
               <w:left w:val="single" w:color="999999" w:sz="4"/>
@@ -1312,6 +1391,7 @@
       <w:tr>
         <w:tc>
           <w:tcPr>
+            <w:tcW w:type="dxa" w:w="4680"/>
             <w:tcBorders>
               <w:top w:val="single" w:color="999999" w:sz="4"/>
               <w:left w:val="single" w:color="999999" w:sz="4"/>
@@ -1327,6 +1407,7 @@
         </w:tc>
         <w:tc>
           <w:tcPr>
+            <w:tcW w:type="dxa" w:w="4680"/>
             <w:tcBorders>
               <w:top w:val="single" w:color="999999" w:sz="4"/>
               <w:left w:val="single" w:color="999999" w:sz="4"/>
@@ -1344,6 +1425,7 @@
       <w:tr>
         <w:tc>
           <w:tcPr>
+            <w:tcW w:type="dxa" w:w="4680"/>
             <w:tcBorders>
               <w:top w:val="single" w:color="999999" w:sz="4"/>
               <w:left w:val="single" w:color="999999" w:sz="4"/>
@@ -1359,6 +1441,7 @@
         </w:tc>
         <w:tc>
           <w:tcPr>
+            <w:tcW w:type="dxa" w:w="4680"/>
             <w:tcBorders>
               <w:top w:val="single" w:color="999999" w:sz="4"/>
               <w:left w:val="single" w:color="999999" w:sz="4"/>
@@ -1376,6 +1459,7 @@
       <w:tr>
         <w:tc>
           <w:tcPr>
+            <w:tcW w:type="dxa" w:w="4680"/>
             <w:tcBorders>
               <w:top w:val="single" w:color="999999" w:sz="4"/>
               <w:left w:val="single" w:color="999999" w:sz="4"/>
@@ -1391,6 +1475,7 @@
         </w:tc>
         <w:tc>
           <w:tcPr>
+            <w:tcW w:type="dxa" w:w="4680"/>
             <w:tcBorders>
               <w:top w:val="single" w:color="999999" w:sz="4"/>
               <w:left w:val="single" w:color="999999" w:sz="4"/>
@@ -1418,7 +1503,7 @@
     </w:p>
     <w:tbl>
       <w:tblPr>
-        <w:tblW w:type="pct" w:w="100%"/>
+        <w:tblW w:type="dxa" w:w="9360"/>
         <w:tblBorders>
           <w:top w:val="single" w:color="auto" w:sz="4"/>
           <w:left w:val="single" w:color="auto" w:sz="4"/>
@@ -1427,14 +1512,17 @@
           <w:insideH w:val="single" w:color="auto" w:sz="4"/>
           <w:insideV w:val="single" w:color="auto" w:sz="4"/>
         </w:tblBorders>
+        <w:tblLayout w:type="fixed"/>
       </w:tblPr>
       <w:tblGrid>
-        <w:gridCol w:w="100"/>
-        <w:gridCol w:w="100"/>
+        <w:gridCol w:w="4680"/>
+        <w:gridCol w:w="4680"/>
       </w:tblGrid>
       <w:tr>
         <w:tc>
           <w:tcPr>
+            <w:tcW w:type="dxa" w:w="9360"/>
+            <w:gridSpan w:val="2"/>
             <w:tcBorders>
               <w:top w:val="single" w:color="999999" w:sz="4"/>
               <w:left w:val="single" w:color="999999" w:sz="4"/>
@@ -1456,6 +1544,7 @@
       <w:tr>
         <w:tc>
           <w:tcPr>
+            <w:tcW w:type="dxa" w:w="4680"/>
             <w:tcBorders>
               <w:top w:val="single" w:color="999999" w:sz="4"/>
               <w:left w:val="single" w:color="999999" w:sz="4"/>
@@ -1471,6 +1560,7 @@
         </w:tc>
         <w:tc>
           <w:tcPr>
+            <w:tcW w:type="dxa" w:w="4680"/>
             <w:tcBorders>
               <w:top w:val="single" w:color="999999" w:sz="4"/>
               <w:left w:val="single" w:color="999999" w:sz="4"/>
@@ -1488,6 +1578,7 @@
       <w:tr>
         <w:tc>
           <w:tcPr>
+            <w:tcW w:type="dxa" w:w="4680"/>
             <w:tcBorders>
               <w:top w:val="single" w:color="999999" w:sz="4"/>
               <w:left w:val="single" w:color="999999" w:sz="4"/>
@@ -1503,6 +1594,7 @@
         </w:tc>
         <w:tc>
           <w:tcPr>
+            <w:tcW w:type="dxa" w:w="4680"/>
             <w:tcBorders>
               <w:top w:val="single" w:color="999999" w:sz="4"/>
               <w:left w:val="single" w:color="999999" w:sz="4"/>

</xml_diff>

<commit_message>
Use real horizontal-rule section separators (fixes nav not rendering)
Sections were separated by a literal "---" text paragraph, which EDS does
not recognize — so nav.docx collapsed into a single section and rendered
nothing when uploaded to Drive. Replace it with an empty paragraph that
carries a bottom border, the horizontal rule EDS reads as a section break
(matching a known-good authored doc). Regenerated all 14 drive-docs.

Co-Authored-By: Claude Opus 4.8 (1M context) <noreply@anthropic.com>
</commit_message>
<xml_diff>
--- a/drive-docs/adobe-partner/arquitectura-headless.docx
+++ b/drive-docs/adobe-partner/arquitectura-headless.docx
@@ -154,9 +154,11 @@
       </w:r>
     </w:p>
     <w:p>
-      <w:r>
-        <w:t xml:space="preserve">---</w:t>
-      </w:r>
+      <w:pPr>
+        <w:pBdr>
+          <w:bottom w:val="single" w:color="000000" w:sz="6" w:space="1"/>
+        </w:pBdr>
+      </w:pPr>
     </w:p>
     <w:tbl>
       <w:tblPr>
@@ -489,9 +491,11 @@
       </w:r>
     </w:p>
     <w:p>
-      <w:r>
-        <w:t xml:space="preserve">---</w:t>
-      </w:r>
+      <w:pPr>
+        <w:pBdr>
+          <w:bottom w:val="single" w:color="000000" w:sz="6" w:space="1"/>
+        </w:pBdr>
+      </w:pPr>
     </w:p>
     <w:tbl>
       <w:tblPr>
@@ -993,9 +997,11 @@
       </w:r>
     </w:p>
     <w:p>
-      <w:r>
-        <w:t xml:space="preserve">---</w:t>
-      </w:r>
+      <w:pPr>
+        <w:pBdr>
+          <w:bottom w:val="single" w:color="000000" w:sz="6" w:space="1"/>
+        </w:pBdr>
+      </w:pPr>
     </w:p>
     <w:tbl>
       <w:tblPr>
@@ -1497,9 +1503,11 @@
       </w:r>
     </w:p>
     <w:p>
-      <w:r>
-        <w:t xml:space="preserve">---</w:t>
-      </w:r>
+      <w:pPr>
+        <w:pBdr>
+          <w:bottom w:val="single" w:color="000000" w:sz="6" w:space="1"/>
+        </w:pBdr>
+      </w:pPr>
     </w:p>
     <w:tbl>
       <w:tblPr>

</xml_diff>